<commit_message>
finished the table and search methods
finished the table in the word doc for the assignment
also made 2 search methods (for the table with probing and for the table
with chaining) to confirm that i was right
</commit_message>
<xml_diff>
--- a/Handouts/WhatWasMadeByMe/FiledInTableFromPowerPoint.docx
+++ b/Handouts/WhatWasMadeByMe/FiledInTableFromPowerPoint.docx
@@ -150,6 +150,7 @@
           </w:tcPr>
           <w:p>
             <w:r>
+              <w:lastRenderedPageBreak/>
               <w:t>Array index</w:t>
             </w:r>
           </w:p>
@@ -793,7 +794,11 @@
           <w:tcPr>
             <w:tcW w:w="4950" w:type="dxa"/>
           </w:tcPr>
-          <w:p/>
+          <w:p>
+            <w:r>
+              <w:t>2</w:t>
+            </w:r>
+          </w:p>
         </w:tc>
         <w:tc>
           <w:tcPr>
@@ -821,7 +826,11 @@
           <w:tcPr>
             <w:tcW w:w="4950" w:type="dxa"/>
           </w:tcPr>
-          <w:p/>
+          <w:p>
+            <w:r>
+              <w:t>1</w:t>
+            </w:r>
+          </w:p>
         </w:tc>
         <w:tc>
           <w:tcPr>
@@ -849,7 +858,11 @@
           <w:tcPr>
             <w:tcW w:w="4950" w:type="dxa"/>
           </w:tcPr>
-          <w:p/>
+          <w:p>
+            <w:r>
+              <w:t>4</w:t>
+            </w:r>
+          </w:p>
         </w:tc>
         <w:tc>
           <w:tcPr>
@@ -877,7 +890,11 @@
           <w:tcPr>
             <w:tcW w:w="4950" w:type="dxa"/>
           </w:tcPr>
-          <w:p/>
+          <w:p>
+            <w:r>
+              <w:t>4</w:t>
+            </w:r>
+          </w:p>
         </w:tc>
         <w:tc>
           <w:tcPr>
@@ -905,7 +922,11 @@
           <w:tcPr>
             <w:tcW w:w="4950" w:type="dxa"/>
           </w:tcPr>
-          <w:p/>
+          <w:p>
+            <w:r>
+              <w:t>2</w:t>
+            </w:r>
+          </w:p>
         </w:tc>
         <w:tc>
           <w:tcPr>
@@ -933,7 +954,11 @@
           <w:tcPr>
             <w:tcW w:w="4950" w:type="dxa"/>
           </w:tcPr>
-          <w:p/>
+          <w:p>
+            <w:r>
+              <w:t>2</w:t>
+            </w:r>
+          </w:p>
         </w:tc>
         <w:tc>
           <w:tcPr>
@@ -950,6 +975,9 @@
     <w:p>
       <w:r>
         <w:t>(I asked in class where an element should be placed in case of collision during bucketing, you said to place it at the end)</w:t>
+      </w:r>
+      <w:r>
+        <w:t xml:space="preserve"> </w:t>
       </w:r>
     </w:p>
     <w:sectPr>

</xml_diff>